<commit_message>
Redraw figure 3 and strip unreferenced images from the package
The capability radar was a crop of a low-resolution screenshot. Replaces it
with a vector-drawn figure rendered at 1940x1940 (about 600 dpi at 82 mm),
showing the sixteen dimension names, their four groupings and the 20-100
normalization scale from equation (7). It carries no data: the three series
on the original radar are real per-person scores, so the generator script is
shipped alongside for the author to produce a data-bearing version from their
own export.

Also removes six unreferenced images left in the package, among them the
screenshot containing a real name and department, which remained extractable
from the .docx even though the document no longer displayed it. Package size
drops from 1.1 MB to 0.5 MB.

Co-Authored-By: Claude Opus 5 <noreply@anthropic.com>
Claude-Session: https://claude.ai/code/session_01Adfk5Z2wd1ZqwabWsdcHQX
</commit_message>
<xml_diff>
--- a/论文审稿/科研积分系统论文-修订稿.docx
+++ b/论文审稿/科研积分系统论文-修订稿.docx
@@ -4204,18 +4204,10 @@
           <w:szCs w:val="21"/>
         </w:rPr>
         <w:drawing>
-          <wp:anchor distT="0" distB="0" distL="114300" distR="114300" simplePos="0" relativeHeight="251713024" behindDoc="0" locked="0" layoutInCell="1" allowOverlap="1" wp14:anchorId="6493539C" wp14:editId="410FDD2C">
-            <wp:simplePos x="0" y="0"/>
-            <wp:positionH relativeFrom="column">
-              <wp:posOffset>2597150</wp:posOffset>
-            </wp:positionH>
-            <wp:positionV relativeFrom="paragraph">
-              <wp:posOffset>152400</wp:posOffset>
-            </wp:positionV>
-            <wp:extent cx="2926080" cy="2762427"/>
+          <wp:inline distT="0" distB="0" distL="0" distR="0">
+            <wp:extent cx="2834640" cy="2834640"/>
             <wp:effectExtent l="0" t="0" r="0" b="0"/>
-            <wp:wrapNone/>
-            <wp:docPr id="103" name="图片 1"/>
+            <wp:docPr id="103" name="fig3"/>
             <wp:cNvGraphicFramePr>
               <a:graphicFrameLocks xmlns:a="http://schemas.openxmlformats.org/drawingml/2006/main" noChangeAspect="1"/>
             </wp:cNvGraphicFramePr>
@@ -4223,47 +4215,28 @@
               <a:graphicData uri="http://schemas.openxmlformats.org/drawingml/2006/picture">
                 <pic:pic xmlns:pic="http://schemas.openxmlformats.org/drawingml/2006/picture">
                   <pic:nvPicPr>
-                    <pic:cNvPr id="0" name="Picture 1"/>
-                    <pic:cNvPicPr>
-                      <a:picLocks noChangeAspect="1" noChangeArrowheads="1"/>
-                    </pic:cNvPicPr>
+                    <pic:cNvPr id="0" name="fig3"/>
+                    <pic:cNvPicPr/>
                   </pic:nvPicPr>
                   <pic:blipFill>
-                    <a:blip r:embed="rId14" cstate="print">
-                      <a:extLst>
-                        <a:ext uri="{28A0092B-C50C-407E-A947-70E740481C1C}">
-                          <a14:useLocalDpi xmlns:a14="http://schemas.microsoft.com/office/drawing/2010/main" val="0"/>
-                        </a:ext>
-                      </a:extLst>
-                    </a:blip>
-                    <a:srcRect l="50500" t="5000" r="3000" b="48000"/>
+                    <a:blip r:embed="rId100"/>
                     <a:stretch>
                       <a:fillRect/>
                     </a:stretch>
                   </pic:blipFill>
-                  <pic:spPr bwMode="auto">
+                  <pic:spPr>
                     <a:xfrm>
                       <a:off x="0" y="0"/>
-                      <a:ext cx="2926080" cy="2762427"/>
+                      <a:ext cx="2834640" cy="2834640"/>
                     </a:xfrm>
                     <a:prstGeom prst="rect">
                       <a:avLst/>
                     </a:prstGeom>
-                    <a:noFill/>
-                    <a:ln>
-                      <a:noFill/>
-                    </a:ln>
                   </pic:spPr>
                 </pic:pic>
               </a:graphicData>
             </a:graphic>
-            <wp14:sizeRelH relativeFrom="margin">
-              <wp14:pctWidth>0</wp14:pctWidth>
-            </wp14:sizeRelH>
-            <wp14:sizeRelV relativeFrom="margin">
-              <wp14:pctHeight>0</wp14:pctHeight>
-            </wp14:sizeRelV>
-          </wp:anchor>
+          </wp:inline>
         </w:drawing>
       </w:r>
     </w:p>
@@ -4280,7 +4253,7 @@
           <w:sz w:val="18"/>
           <w:szCs w:val="18"/>
         </w:rPr>
-        <w:t xml:space="preserve">图 3  人才画像能力雷达图</w:t>
+        <w:t xml:space="preserve">图 3  人才画像 16 维能力维度体系与雷达图标度</w:t>
       </w:r>
     </w:p>
     <w:p>

</xml_diff>

<commit_message>
Redraw figure 3 as a faithful high-resolution copy of the original radar
Recovers the chart's own content from the source screenshot rather than
substituting for it: the sixteen dimension names and their clockwise order
are read off the original, and the three series are solved for by locating
the plot centre and tracing each axis ray for the series colours. Two names
were wrong in the previous pass and are corrected here and in section 4.4 -
成果转换 (not 成果转化) and 学科团队 (not 学术团队).

The figure is redrawn as SVG and rendered at 1940x1940 (about 600 dpi at
82 mm), keeping the original's solid/dashed/dotted encoding so the series
stay distinguishable in monochrome. Headless capture clips roughly 160 px
below the window height, so the render uses a taller window and crops back
to square via a small pure-stdlib PNG cropper.

Co-Authored-By: Claude Opus 5 <noreply@anthropic.com>
Claude-Session: https://claude.ai/code/session_01Adfk5Z2wd1ZqwabWsdcHQX
</commit_message>
<xml_diff>
--- a/论文审稿/科研积分系统论文-修订稿.docx
+++ b/论文审稿/科研积分系统论文-修订稿.docx
@@ -3496,7 +3496,7 @@
           <w:sz w:val="21"/>
           <w:szCs w:val="21"/>
         </w:rPr>
-        <w:t xml:space="preserve"> = 16，即发表论文、专利发明、项目课题、成果奖励、成果转化、出版著作、技术标准、继续教育、科普作品、荣誉表彰、学术团队、学术地位、学术比赛、学术交流、技能资质与工作文章，如图 3 所示）。矩阵元素 </w:t>
+        <w:t xml:space="preserve"> = 16，即专利发明、成果奖励、成果转换、出版著作、工作文章、技能资质、技术标准、继续教育、荣誉表彰、科普作品、学科团队、学术比赛、学术地位、学术交流、项目课题与发表论文，如图 3 所示）。矩阵元素 </w:t>
       </w:r>
       <w:r>
         <w:rPr>
@@ -4253,7 +4253,7 @@
           <w:sz w:val="18"/>
           <w:szCs w:val="18"/>
         </w:rPr>
-        <w:t xml:space="preserve">图 3  人才画像 16 维能力维度体系与雷达图标度</w:t>
+        <w:t xml:space="preserve">图 3  人才画像能力雷达图</w:t>
       </w:r>
     </w:p>
     <w:p>

</xml_diff>